<commit_message>
Update resume name and leadership
</commit_message>
<xml_diff>
--- a/resumes/masters/Ching-Wei-Kang-Masters-Application-CV.docx
+++ b/resumes/masters/Ching-Wei-Kang-Masters-Application-CV.docx
@@ -14,7 +14,7 @@
           <w:color w:val="000000"/>
           <w:sz w:val="30"/>
         </w:rPr>
-        <w:t>CHING-WEI KANG</w:t>
+        <w:t>CHING-WEI (WILLIAM) KANG</w:t>
       </w:r>
     </w:p>
     <w:p>
@@ -1712,6 +1712,72 @@
           <w:color w:val="000000"/>
           <w:sz w:val="18"/>
         </w:rPr>
+        <w:t>China and U.S. Engagement at GWU - Founder and Head of Logistics</w:t>
+      </w:r>
+      <w:r>
+        <w:rPr>
+          <w:rFonts w:ascii="Arial" w:hAnsi="Arial"/>
+          <w:color w:val="000000"/>
+          <w:sz w:val="18"/>
+        </w:rPr>
+        <w:t xml:space="preserve"> | Aug 2024 - Present</w:t>
+      </w:r>
+    </w:p>
+    <w:p>
+      <w:pPr>
+        <w:keepLines/>
+        <w:spacing w:after="16" w:line="240" w:lineRule="auto"/>
+        <w:ind w:left="259" w:hanging="173"/>
+      </w:pPr>
+      <w:r>
+        <w:rPr>
+          <w:rFonts w:ascii="Arial" w:hAnsi="Arial"/>
+          <w:b/>
+          <w:color w:val="000000"/>
+          <w:sz w:val="18"/>
+        </w:rPr>
+        <w:t xml:space="preserve">•  </w:t>
+      </w:r>
+      <w:r>
+        <w:rPr>
+          <w:rFonts w:ascii="Arial" w:hAnsi="Arial"/>
+          <w:b/>
+          <w:color w:val="000000"/>
+          <w:sz w:val="18"/>
+        </w:rPr>
+        <w:t>China Student Development Think Tank - Leader and Head Scheduler</w:t>
+      </w:r>
+      <w:r>
+        <w:rPr>
+          <w:rFonts w:ascii="Arial" w:hAnsi="Arial"/>
+          <w:color w:val="000000"/>
+          <w:sz w:val="18"/>
+        </w:rPr>
+        <w:t xml:space="preserve"> | Aug 2023 - Present</w:t>
+      </w:r>
+    </w:p>
+    <w:p>
+      <w:pPr>
+        <w:keepLines/>
+        <w:spacing w:after="16" w:line="240" w:lineRule="auto"/>
+        <w:ind w:left="259" w:hanging="173"/>
+      </w:pPr>
+      <w:r>
+        <w:rPr>
+          <w:rFonts w:ascii="Arial" w:hAnsi="Arial"/>
+          <w:b/>
+          <w:color w:val="000000"/>
+          <w:sz w:val="18"/>
+        </w:rPr>
+        <w:t xml:space="preserve">•  </w:t>
+      </w:r>
+      <w:r>
+        <w:rPr>
+          <w:rFonts w:ascii="Arial" w:hAnsi="Arial"/>
+          <w:b/>
+          <w:color w:val="000000"/>
+          <w:sz w:val="18"/>
+        </w:rPr>
         <w:t>UW-Madison Data Science Club</w:t>
       </w:r>
       <w:r>

</xml_diff>

<commit_message>
Rebalance master CV and remove unverifiable internship
</commit_message>
<xml_diff>
--- a/resumes/masters/Ching-Wei-Kang-Masters-Application-CV.docx
+++ b/resumes/masters/Ching-Wei-Kang-Masters-Application-CV.docx
@@ -717,101 +717,6 @@
           <w:color w:val="000000"/>
           <w:sz w:val="19"/>
         </w:rPr>
-        <w:t>The Marcus Harris Foundation</w:t>
-      </w:r>
-      <w:r>
-        <w:tab/>
-      </w:r>
-      <w:r>
-        <w:rPr>
-          <w:rFonts w:ascii="Arial" w:hAnsi="Arial"/>
-          <w:b/>
-          <w:i w:val="0"/>
-          <w:color w:val="000000"/>
-          <w:sz w:val="19"/>
-        </w:rPr>
-        <w:t>Washington, DC</w:t>
-      </w:r>
-    </w:p>
-    <w:p>
-      <w:pPr>
-        <w:keepNext/>
-        <w:tabs>
-          <w:tab w:pos="10656" w:val="right"/>
-        </w:tabs>
-        <w:spacing w:before="0" w:after="0"/>
-      </w:pPr>
-      <w:r>
-        <w:rPr>
-          <w:rFonts w:ascii="Arial" w:hAnsi="Arial"/>
-          <w:b/>
-          <w:color w:val="000000"/>
-          <w:sz w:val="18"/>
-        </w:rPr>
-        <w:t>Data Engineering and Automation Intern</w:t>
-      </w:r>
-      <w:r>
-        <w:tab/>
-      </w:r>
-      <w:r>
-        <w:rPr>
-          <w:rFonts w:ascii="Arial" w:hAnsi="Arial"/>
-          <w:b w:val="0"/>
-          <w:i/>
-          <w:color w:val="000000"/>
-          <w:sz w:val="18"/>
-        </w:rPr>
-        <w:t>Sep 2024 - Dec 2024</w:t>
-      </w:r>
-    </w:p>
-    <w:p>
-      <w:pPr>
-        <w:keepLines/>
-        <w:spacing w:after="16" w:line="240" w:lineRule="auto"/>
-        <w:ind w:left="259" w:hanging="173"/>
-      </w:pPr>
-      <w:r>
-        <w:rPr>
-          <w:rFonts w:ascii="Arial" w:hAnsi="Arial"/>
-          <w:b/>
-          <w:color w:val="000000"/>
-          <w:sz w:val="18"/>
-        </w:rPr>
-        <w:t xml:space="preserve">•  </w:t>
-      </w:r>
-      <w:r>
-        <w:rPr>
-          <w:rFonts w:ascii="Arial" w:hAnsi="Arial"/>
-          <w:b/>
-          <w:color w:val="000000"/>
-          <w:sz w:val="18"/>
-        </w:rPr>
-        <w:t>Made nonprofit registry data usable for reporting</w:t>
-      </w:r>
-      <w:r>
-        <w:rPr>
-          <w:rFonts w:ascii="Arial" w:hAnsi="Arial"/>
-          <w:color w:val="000000"/>
-          <w:sz w:val="18"/>
-        </w:rPr>
-        <w:t xml:space="preserve"> by building a BeautifulSoup, Requests, and Pandas ingestion pipeline that loaded 50,000+ PostgreSQL records with 98% accuracy.</w:t>
-      </w:r>
-    </w:p>
-    <w:p>
-      <w:pPr>
-        <w:keepNext/>
-        <w:tabs>
-          <w:tab w:pos="10656" w:val="right"/>
-        </w:tabs>
-        <w:spacing w:before="12" w:after="0"/>
-      </w:pPr>
-      <w:r>
-        <w:rPr>
-          <w:rFonts w:ascii="Arial" w:hAnsi="Arial"/>
-          <w:b/>
-          <w:color w:val="000000"/>
-          <w:sz w:val="19"/>
-        </w:rPr>
         <w:t>Springer Capital</w:t>
       </w:r>
       <w:r>
@@ -1266,7 +1171,6 @@
     <w:p>
       <w:pPr>
         <w:keepNext/>
-        <w:pageBreakBefore/>
         <w:tabs>
           <w:tab w:pos="10656" w:val="right"/>
         </w:tabs>

</xml_diff>

<commit_message>
Expand master CV open source case studies
</commit_message>
<xml_diff>
--- a/resumes/masters/Ching-Wei-Kang-Masters-Application-CV.docx
+++ b/resumes/masters/Ching-Wei-Kang-Masters-Application-CV.docx
@@ -1757,7 +1757,7 @@
           <w:color w:val="000000"/>
           <w:sz w:val="18"/>
         </w:rPr>
-        <w:t>Contributed through maintainer review and CI workflows</w:t>
+        <w:t>Cloudflare vinext #2521:</w:t>
       </w:r>
       <w:r>
         <w:rPr>
@@ -1765,7 +1765,106 @@
           <w:color w:val="000000"/>
           <w:sz w:val="18"/>
         </w:rPr>
-        <w:t xml:space="preserve"> to GitHub Docs, Docker CLI, Microsoft APM, NVIDIA NemoClaw, Meta DotSlash, Repomix, and other developer tools.</w:t>
+        <w:t xml:space="preserve"> propagated resolved Next.js server externals into Nitro traceDeps while preserving and de-duplicating user configuration; added regression coverage across default packages, custom externals, development mode, and production builds.</w:t>
+      </w:r>
+    </w:p>
+    <w:p>
+      <w:pPr>
+        <w:keepLines/>
+        <w:spacing w:after="16" w:line="240" w:lineRule="auto"/>
+        <w:ind w:left="259" w:hanging="173"/>
+      </w:pPr>
+      <w:r>
+        <w:rPr>
+          <w:rFonts w:ascii="Arial" w:hAnsi="Arial"/>
+          <w:b/>
+          <w:color w:val="000000"/>
+          <w:sz w:val="18"/>
+        </w:rPr>
+        <w:t xml:space="preserve">•  </w:t>
+      </w:r>
+      <w:r>
+        <w:rPr>
+          <w:rFonts w:ascii="Arial" w:hAnsi="Arial"/>
+          <w:b/>
+          <w:color w:val="000000"/>
+          <w:sz w:val="18"/>
+        </w:rPr>
+        <w:t>Microsoft APM #1971:</w:t>
+      </w:r>
+      <w:r>
+        <w:rPr>
+          <w:rFonts w:ascii="Arial" w:hAnsi="Arial"/>
+          <w:color w:val="000000"/>
+          <w:sz w:val="18"/>
+        </w:rPr>
+        <w:t xml:space="preserve"> enforced least-privilege 0o700 permissions for deployed plugin executables and normalized deny-list identities to prevent bypasses through casing, .git suffixes, or alternate GitHub URL forms; added integration and mutation-regression tests.</w:t>
+      </w:r>
+    </w:p>
+    <w:p>
+      <w:pPr>
+        <w:keepLines/>
+        <w:spacing w:after="16" w:line="240" w:lineRule="auto"/>
+        <w:ind w:left="259" w:hanging="173"/>
+      </w:pPr>
+      <w:r>
+        <w:rPr>
+          <w:rFonts w:ascii="Arial" w:hAnsi="Arial"/>
+          <w:b/>
+          <w:color w:val="000000"/>
+          <w:sz w:val="18"/>
+        </w:rPr>
+        <w:t xml:space="preserve">•  </w:t>
+      </w:r>
+      <w:r>
+        <w:rPr>
+          <w:rFonts w:ascii="Arial" w:hAnsi="Arial"/>
+          <w:b/>
+          <w:color w:val="000000"/>
+          <w:sz w:val="18"/>
+        </w:rPr>
+        <w:t>NVIDIA NemoClaw #5676:</w:t>
+      </w:r>
+      <w:r>
+        <w:rPr>
+          <w:rFonts w:ascii="Arial" w:hAnsi="Arial"/>
+          <w:color w:val="000000"/>
+          <w:sz w:val="18"/>
+        </w:rPr>
+        <w:t xml:space="preserve"> hardened agents-list parsing against warning text and multiple JSON response schemas while preserving agent-ID filtering; validated the change with targeted tests, linting, CLI builds, and type checking.</w:t>
+      </w:r>
+    </w:p>
+    <w:p>
+      <w:pPr>
+        <w:keepLines/>
+        <w:spacing w:after="16" w:line="240" w:lineRule="auto"/>
+        <w:ind w:left="259" w:hanging="173"/>
+      </w:pPr>
+      <w:r>
+        <w:rPr>
+          <w:rFonts w:ascii="Arial" w:hAnsi="Arial"/>
+          <w:b/>
+          <w:color w:val="000000"/>
+          <w:sz w:val="18"/>
+        </w:rPr>
+        <w:t xml:space="preserve">•  </w:t>
+      </w:r>
+      <w:r>
+        <w:rPr>
+          <w:rFonts w:ascii="Arial" w:hAnsi="Arial"/>
+          <w:b/>
+          <w:color w:val="000000"/>
+          <w:sz w:val="18"/>
+        </w:rPr>
+        <w:t>Meta DotSlash #16:</w:t>
+      </w:r>
+      <w:r>
+        <w:rPr>
+          <w:rFonts w:ascii="Arial" w:hAnsi="Arial"/>
+          <w:color w:val="000000"/>
+          <w:sz w:val="18"/>
+        </w:rPr>
+        <w:t xml:space="preserve"> added portable SHA-256 verification for downloaded release assets before extraction, resolving platform-specific asset metadata and supporting sha256sum with a shasum fallback across macOS, Windows, and Linux release targets.</w:t>
       </w:r>
     </w:p>
     <w:p>

</xml_diff>